<commit_message>
Tighten page allowances and define page/blog scope in SEO agreements
$99 template: up to 2 pages/month for months 1-2, then up to 4 total for
months 3-12. All allowances are now ceilings ("up to"), and page additions
and blog drafts have a defined size so they can't stretch into custom work.
Wandering Free Counseling keeps the allowance from its quoted pricing sheet.

Co-Authored-By: Claude Opus 5.5 <noreply@anthropic.com>
Claude-Session: https://claude.ai/code/session_01LAdaLZ75DNLMopQvwyfP4Q
</commit_message>
<xml_diff>
--- a/SEO-Clients-Hub/_templates/contracts/output/TEMPLATE-Growth-SEO-149-Agreement.docx
+++ b/SEO-Clients-Hub/_templates/contracts/output/TEMPLATE-Growth-SEO-149-Agreement.docx
@@ -1457,7 +1457,7 @@
           <w:sz w:val="22"/>
           <w:szCs w:val="22"/>
         </w:rPr>
-        <w:t xml:space="preserve">C. Monthly Content Allowances</w:t>
+        <w:t xml:space="preserve">C. Content Allowances</w:t>
       </w:r>
     </w:p>
     <w:p>
@@ -1484,6 +1484,32 @@
       </w:pPr>
       <w:r>
         <w:t xml:space="preserve">Blog post drafts: up to two (2) SEO-optimized blog post drafts per service month throughout the Initial Term.</w:t>
+      </w:r>
+    </w:p>
+    <w:p>
+      <w:pPr>
+        <w:pStyle w:val="ListParagraph"/>
+        <w:numPr>
+          <w:ilvl w:val="0"/>
+          <w:numId w:val="2"/>
+        </w:numPr>
+        <w:spacing w:after="60" w:line="264"/>
+      </w:pPr>
+      <w:r>
+        <w:t xml:space="preserve">A "page addition" means one standard informational content page of up to approximately eight hundred (800) words, built using an existing layout or template on Client's website. Custom-designed layouts, landing pages with forms, booking tools, or other integrations, and pages exceeding this length require a written change order.</w:t>
+      </w:r>
+    </w:p>
+    <w:p>
+      <w:pPr>
+        <w:pStyle w:val="ListParagraph"/>
+        <w:numPr>
+          <w:ilvl w:val="0"/>
+          <w:numId w:val="2"/>
+        </w:numPr>
+        <w:spacing w:after="60" w:line="264"/>
+      </w:pPr>
+      <w:r>
+        <w:t xml:space="preserve">A "blog post draft" means one SEO-optimized article of up to approximately one thousand (1,000) words, drafted for Client's review and approval before publication.</w:t>
       </w:r>
     </w:p>
     <w:p>
@@ -1645,7 +1671,7 @@
         <w:spacing w:after="60" w:line="264"/>
       </w:pPr>
       <w:r>
-        <w:t xml:space="preserve">Monthly allowances expire at the end of the applicable service month and do not roll over unless Provider agrees otherwise in writing.</w:t>
+        <w:t xml:space="preserve">Allowances apply only to the service month or period stated above, expire at the end of that month or period, and do not roll over unless Provider agrees otherwise in writing.</w:t>
       </w:r>
     </w:p>
     <w:p>

</xml_diff>

<commit_message>
Reduce Growth SEO ($149) content allowances in template
Pages: up to 2/month for months 1-3, then up to 6 total for months 4-12.
Blogs: up to 2/month for months 1-3, then up to 1/month for months 4-12.
Wandering Free Counseling's Growth contract keeps its quoted allowances.

Co-Authored-By: Claude Opus 5.5 <noreply@anthropic.com>
Claude-Session: https://claude.ai/code/session_01LAdaLZ75DNLMopQvwyfP4Q
</commit_message>
<xml_diff>
--- a/SEO-Clients-Hub/_templates/contracts/output/TEMPLATE-Growth-SEO-149-Agreement.docx
+++ b/SEO-Clients-Hub/_templates/contracts/output/TEMPLATE-Growth-SEO-149-Agreement.docx
@@ -1470,20 +1470,20 @@
         <w:spacing w:after="60" w:line="264"/>
       </w:pPr>
       <w:r>
-        <w:t xml:space="preserve">Web page additions: up to two (2) new pages per service month during service months one (1) through six (6), then up to one (1) new page per service month during service months seven (7) through twelve (12).</w:t>
-      </w:r>
-    </w:p>
-    <w:p>
-      <w:pPr>
-        <w:pStyle w:val="ListParagraph"/>
-        <w:numPr>
-          <w:ilvl w:val="0"/>
-          <w:numId w:val="2"/>
-        </w:numPr>
-        <w:spacing w:after="60" w:line="264"/>
-      </w:pPr>
-      <w:r>
-        <w:t xml:space="preserve">Blog post drafts: up to two (2) SEO-optimized blog post drafts per service month throughout the Initial Term.</w:t>
+        <w:t xml:space="preserve">Web page additions: up to two (2) new pages per service month during service months one (1) through three (3), then up to six (6) new pages in total during service months four (4) through twelve (12).</w:t>
+      </w:r>
+    </w:p>
+    <w:p>
+      <w:pPr>
+        <w:pStyle w:val="ListParagraph"/>
+        <w:numPr>
+          <w:ilvl w:val="0"/>
+          <w:numId w:val="2"/>
+        </w:numPr>
+        <w:spacing w:after="60" w:line="264"/>
+      </w:pPr>
+      <w:r>
+        <w:t xml:space="preserve">Blog post drafts: up to two (2) SEO-optimized blog post drafts per service month during service months one (1) through three (3), then up to one (1) per service month during service months four (4) through twelve (12).</w:t>
       </w:r>
     </w:p>
     <w:p>

</xml_diff>

<commit_message>
Add extra-work rates to agreements and a client welcome checklist
Exhibit A now lists add-on rates (extra page $75, extra blog post $50,
custom work quoted by change order); the pricing template mentions them too.
New build-welcome.js generates a Getting Started checklist covering website,
Google Business Profile, Analytics and Search Console access plus practice
info, with a blank template and a Wandering Free Counseling version.

Co-Authored-By: Claude Opus 5.5 <noreply@anthropic.com>
Claude-Session: https://claude.ai/code/session_01LAdaLZ75DNLMopQvwyfP4Q
</commit_message>
<xml_diff>
--- a/SEO-Clients-Hub/_templates/contracts/output/TEMPLATE-Growth-SEO-149-Agreement.docx
+++ b/SEO-Clients-Hub/_templates/contracts/output/TEMPLATE-Growth-SEO-149-Agreement.docx
@@ -1275,7 +1275,7 @@
           <w:ilvl w:val="0"/>
           <w:numId w:val="2"/>
         </w:numPr>
-        <w:spacing w:after="60" w:line="264"/>
+        <w:spacing w:after="40" w:line="259"/>
       </w:pPr>
       <w:r>
         <w:t xml:space="preserve">On-page SEO optimization, including titles, meta descriptions, and headings.</w:t>
@@ -1288,7 +1288,7 @@
           <w:ilvl w:val="0"/>
           <w:numId w:val="2"/>
         </w:numPr>
-        <w:spacing w:after="60" w:line="264"/>
+        <w:spacing w:after="40" w:line="259"/>
       </w:pPr>
       <w:r>
         <w:t xml:space="preserve">Advanced specialty keyword research and targeting relevant to Client's specialties (</w:t>
@@ -1321,7 +1321,7 @@
           <w:ilvl w:val="0"/>
           <w:numId w:val="2"/>
         </w:numPr>
-        <w:spacing w:after="60" w:line="264"/>
+        <w:spacing w:after="40" w:line="259"/>
       </w:pPr>
       <w:r>
         <w:t xml:space="preserve">Image optimization for SEO and accessibility (including alt text), limited to images touched during included work.</w:t>
@@ -1334,7 +1334,7 @@
           <w:ilvl w:val="0"/>
           <w:numId w:val="2"/>
         </w:numPr>
-        <w:spacing w:after="60" w:line="264"/>
+        <w:spacing w:after="40" w:line="259"/>
       </w:pPr>
       <w:r>
         <w:t xml:space="preserve">Google Business Profile optimization, subject to platform access, verification, and policy.</w:t>
@@ -1347,7 +1347,7 @@
           <w:ilvl w:val="0"/>
           <w:numId w:val="2"/>
         </w:numPr>
-        <w:spacing w:after="60" w:line="264"/>
+        <w:spacing w:after="40" w:line="259"/>
       </w:pPr>
       <w:r>
         <w:t xml:space="preserve">Technical SEO improvements that are reasonably achievable within the existing website and hosting framework.</w:t>
@@ -1360,7 +1360,7 @@
           <w:ilvl w:val="0"/>
           <w:numId w:val="2"/>
         </w:numPr>
-        <w:spacing w:after="60" w:line="264"/>
+        <w:spacing w:after="40" w:line="259"/>
       </w:pPr>
       <w:r>
         <w:t xml:space="preserve">Google Analytics and Google Search Console setup or configuration, using Client-owned accounts where available.</w:t>
@@ -1373,7 +1373,7 @@
           <w:ilvl w:val="0"/>
           <w:numId w:val="2"/>
         </w:numPr>
-        <w:spacing w:after="60" w:line="264"/>
+        <w:spacing w:after="40" w:line="259"/>
       </w:pPr>
       <w:r>
         <w:t xml:space="preserve">Schema implementation appropriate to the business, such as LocalBusiness and therapist-related schema, where technically appropriate.</w:t>
@@ -1386,7 +1386,7 @@
           <w:ilvl w:val="0"/>
           <w:numId w:val="2"/>
         </w:numPr>
-        <w:spacing w:after="60" w:line="264"/>
+        <w:spacing w:after="40" w:line="259"/>
       </w:pPr>
       <w:r>
         <w:t xml:space="preserve">Content and SEO recommendations.</w:t>
@@ -1399,7 +1399,7 @@
           <w:ilvl w:val="0"/>
           <w:numId w:val="2"/>
         </w:numPr>
-        <w:spacing w:after="60" w:line="264"/>
+        <w:spacing w:after="40" w:line="259"/>
       </w:pPr>
       <w:r>
         <w:t xml:space="preserve">Competitor research and insights.</w:t>
@@ -1412,7 +1412,7 @@
           <w:ilvl w:val="0"/>
           <w:numId w:val="2"/>
         </w:numPr>
-        <w:spacing w:after="60" w:line="264"/>
+        <w:spacing w:after="40" w:line="259"/>
       </w:pPr>
       <w:r>
         <w:t xml:space="preserve">Advanced SEO strategy, including AI-search visibility and long-term growth recommendations.</w:t>
@@ -1425,7 +1425,7 @@
           <w:ilvl w:val="0"/>
           <w:numId w:val="2"/>
         </w:numPr>
-        <w:spacing w:after="60" w:line="264"/>
+        <w:spacing w:after="40" w:line="259"/>
       </w:pPr>
       <w:r>
         <w:t xml:space="preserve">Monthly monitoring and performance checks.</w:t>
@@ -1438,7 +1438,7 @@
           <w:ilvl w:val="0"/>
           <w:numId w:val="2"/>
         </w:numPr>
-        <w:spacing w:after="60" w:line="264"/>
+        <w:spacing w:after="40" w:line="259"/>
       </w:pPr>
       <w:r>
         <w:t xml:space="preserve">Monthly reporting.</w:t>
@@ -1467,7 +1467,7 @@
           <w:ilvl w:val="0"/>
           <w:numId w:val="2"/>
         </w:numPr>
-        <w:spacing w:after="60" w:line="264"/>
+        <w:spacing w:after="40" w:line="259"/>
       </w:pPr>
       <w:r>
         <w:t xml:space="preserve">Web page additions: up to two (2) new pages per service month during service months one (1) through three (3), then up to six (6) new pages in total during service months four (4) through twelve (12).</w:t>
@@ -1480,7 +1480,7 @@
           <w:ilvl w:val="0"/>
           <w:numId w:val="2"/>
         </w:numPr>
-        <w:spacing w:after="60" w:line="264"/>
+        <w:spacing w:after="40" w:line="259"/>
       </w:pPr>
       <w:r>
         <w:t xml:space="preserve">Blog post drafts: up to two (2) SEO-optimized blog post drafts per service month during service months one (1) through three (3), then up to one (1) per service month during service months four (4) through twelve (12).</w:t>
@@ -1493,7 +1493,7 @@
           <w:ilvl w:val="0"/>
           <w:numId w:val="2"/>
         </w:numPr>
-        <w:spacing w:after="60" w:line="264"/>
+        <w:spacing w:after="40" w:line="259"/>
       </w:pPr>
       <w:r>
         <w:t xml:space="preserve">A "page addition" means one standard informational content page of up to approximately eight hundred (800) words, built using an existing layout or template on Client's website. Custom-designed layouts, landing pages with forms, booking tools, or other integrations, and pages exceeding this length require a written change order.</w:t>
@@ -1506,7 +1506,7 @@
           <w:ilvl w:val="0"/>
           <w:numId w:val="2"/>
         </w:numPr>
-        <w:spacing w:after="60" w:line="264"/>
+        <w:spacing w:after="40" w:line="259"/>
       </w:pPr>
       <w:r>
         <w:t xml:space="preserve">A "blog post draft" means one SEO-optimized article of up to approximately one thousand (1,000) words, drafted for Client's review and approval before publication.</w:t>
@@ -1535,7 +1535,7 @@
           <w:ilvl w:val="0"/>
           <w:numId w:val="2"/>
         </w:numPr>
-        <w:spacing w:after="60" w:line="264"/>
+        <w:spacing w:after="40" w:line="259"/>
       </w:pPr>
       <w:r>
         <w:t xml:space="preserve">Website hosting, domain registration, email hosting, platform subscriptions, paid themes, premium plugins, stock media, or other third-party fees.</w:t>
@@ -1548,7 +1548,7 @@
           <w:ilvl w:val="0"/>
           <w:numId w:val="2"/>
         </w:numPr>
-        <w:spacing w:after="60" w:line="264"/>
+        <w:spacing w:after="40" w:line="259"/>
       </w:pPr>
       <w:r>
         <w:t xml:space="preserve">A website rebuild, migration, replatforming, custom application development, custom plugin development, or material redesign of the existing framework.</w:t>
@@ -1561,7 +1561,7 @@
           <w:ilvl w:val="0"/>
           <w:numId w:val="2"/>
         </w:numPr>
-        <w:spacing w:after="60" w:line="264"/>
+        <w:spacing w:after="40" w:line="259"/>
       </w:pPr>
       <w:r>
         <w:t xml:space="preserve">Paid advertising, social-media services, public-relations services, or other marketing work not expressly included above.</w:t>
@@ -1574,7 +1574,7 @@
           <w:ilvl w:val="0"/>
           <w:numId w:val="2"/>
         </w:numPr>
-        <w:spacing w:after="60" w:line="264"/>
+        <w:spacing w:after="40" w:line="259"/>
       </w:pPr>
       <w:r>
         <w:t xml:space="preserve">Legal, clinical, privacy, HIPAA, cybersecurity, or accessibility audits, certifications, or remediation.</w:t>
@@ -1587,7 +1587,7 @@
           <w:ilvl w:val="0"/>
           <w:numId w:val="2"/>
         </w:numPr>
-        <w:spacing w:after="60" w:line="264"/>
+        <w:spacing w:after="40" w:line="259"/>
       </w:pPr>
       <w:r>
         <w:t xml:space="preserve">Emergency support, restoration from backup, malware removal, incident response, or repair of pre-existing defects unless added by change order.</w:t>
@@ -1616,7 +1616,7 @@
           <w:ilvl w:val="0"/>
           <w:numId w:val="2"/>
         </w:numPr>
-        <w:spacing w:after="60" w:line="264"/>
+        <w:spacing w:after="40" w:line="259"/>
       </w:pPr>
       <w:r>
         <w:t xml:space="preserve">Provider will prioritize work based on SEO impact, technical feasibility, and timely Client approvals.</w:t>
@@ -1629,7 +1629,7 @@
           <w:ilvl w:val="0"/>
           <w:numId w:val="2"/>
         </w:numPr>
-        <w:spacing w:after="60" w:line="264"/>
+        <w:spacing w:after="40" w:line="259"/>
       </w:pPr>
       <w:r>
         <w:t xml:space="preserve">Client will keep its website, hosting, domain, theme, plugins, and required third-party accounts active and in good standing.</w:t>
@@ -1642,7 +1642,7 @@
           <w:ilvl w:val="0"/>
           <w:numId w:val="2"/>
         </w:numPr>
-        <w:spacing w:after="60" w:line="264"/>
+        <w:spacing w:after="40" w:line="259"/>
       </w:pPr>
       <w:r>
         <w:t xml:space="preserve">Client will provide credentials through a reasonably secure method and will maintain backups appropriate to its risk.</w:t>
@@ -1655,7 +1655,7 @@
           <w:ilvl w:val="0"/>
           <w:numId w:val="2"/>
         </w:numPr>
-        <w:spacing w:after="60" w:line="264"/>
+        <w:spacing w:after="40" w:line="259"/>
       </w:pPr>
       <w:r>
         <w:t xml:space="preserve">Each included page addition and blog post draft is subject to timely source information from Client and one consolidated round of reasonable revisions. Client reviews and approves all content before publication. Substantial rewrites, material redesigns, or changes in direction require a written change order.</w:t>
@@ -1668,7 +1668,7 @@
           <w:ilvl w:val="0"/>
           <w:numId w:val="2"/>
         </w:numPr>
-        <w:spacing w:after="60" w:line="264"/>
+        <w:spacing w:after="40" w:line="259"/>
       </w:pPr>
       <w:r>
         <w:t xml:space="preserve">Allowances apply only to the service month or period stated above, expire at the end of that month or period, and do not roll over unless Provider agrees otherwise in writing.</w:t>
@@ -1681,7 +1681,7 @@
           <w:ilvl w:val="0"/>
           <w:numId w:val="2"/>
         </w:numPr>
-        <w:spacing w:after="60" w:line="264"/>
+        <w:spacing w:after="40" w:line="259"/>
       </w:pPr>
       <w:r>
         <w:t xml:space="preserve">A "service month" is each consecutive one-month period beginning on the Effective Date.</w:t>
@@ -1694,7 +1694,7 @@
           <w:ilvl w:val="0"/>
           <w:numId w:val="2"/>
         </w:numPr>
-        <w:spacing w:after="60" w:line="264"/>
+        <w:spacing w:after="40" w:line="259"/>
       </w:pPr>
       <w:r>
         <w:t xml:space="preserve">Reports may be delivered electronically. Meetings are not included unless separately scheduled or stated in writing.</w:t>
@@ -2009,7 +2009,201 @@
           <w:sz w:val="22"/>
           <w:szCs w:val="22"/>
         </w:rPr>
-        <w:t xml:space="preserve">G. SEO-Only Renewal Services</w:t>
+        <w:t xml:space="preserve">G. Additional Work Rates</w:t>
+      </w:r>
+    </w:p>
+    <w:p>
+      <w:pPr>
+        <w:spacing w:after="100" w:line="264"/>
+      </w:pPr>
+      <w:r>
+        <w:t xml:space="preserve">Client may request work beyond the allowances in this Exhibit at the following rates. Each request is approved in writing (email is sufficient) before work begins and is billed with the next monthly invoice.</w:t>
+      </w:r>
+    </w:p>
+    <w:tbl>
+      <w:tblPr>
+        <w:tblW w:type="dxa" w:w="9360"/>
+        <w:tblBorders>
+          <w:top w:val="single" w:color="auto" w:sz="4"/>
+          <w:left w:val="single" w:color="auto" w:sz="4"/>
+          <w:bottom w:val="single" w:color="auto" w:sz="4"/>
+          <w:right w:val="single" w:color="auto" w:sz="4"/>
+          <w:insideH w:val="single" w:color="auto" w:sz="4"/>
+          <w:insideV w:val="single" w:color="auto" w:sz="4"/>
+        </w:tblBorders>
+      </w:tblPr>
+      <w:tblGrid>
+        <w:gridCol w:w="3000"/>
+        <w:gridCol w:w="6360"/>
+      </w:tblGrid>
+      <w:tr>
+        <w:tc>
+          <w:tcPr>
+            <w:tcW w:type="dxa" w:w="3000"/>
+            <w:tcBorders>
+              <w:top w:val="single" w:color="000000" w:sz="4"/>
+              <w:left w:val="single" w:color="000000" w:sz="4"/>
+              <w:bottom w:val="single" w:color="000000" w:sz="4"/>
+              <w:right w:val="single" w:color="000000" w:sz="4"/>
+            </w:tcBorders>
+            <w:shd w:fill="F1F3F8" w:color="auto" w:val="clear"/>
+            <w:tcMar>
+              <w:top w:type="dxa" w:w="80"/>
+              <w:left w:type="dxa" w:w="120"/>
+              <w:bottom w:type="dxa" w:w="80"/>
+              <w:right w:type="dxa" w:w="120"/>
+            </w:tcMar>
+          </w:tcPr>
+          <w:p>
+            <w:r>
+              <w:rPr>
+                <w:b/>
+                <w:bCs/>
+              </w:rPr>
+              <w:t xml:space="preserve">Additional page</w:t>
+            </w:r>
+          </w:p>
+        </w:tc>
+        <w:tc>
+          <w:tcPr>
+            <w:tcW w:type="dxa" w:w="6360"/>
+            <w:tcBorders>
+              <w:top w:val="single" w:color="000000" w:sz="4"/>
+              <w:left w:val="single" w:color="000000" w:sz="4"/>
+              <w:bottom w:val="single" w:color="000000" w:sz="4"/>
+              <w:right w:val="single" w:color="000000" w:sz="4"/>
+            </w:tcBorders>
+            <w:tcMar>
+              <w:top w:type="dxa" w:w="80"/>
+              <w:left w:type="dxa" w:w="120"/>
+              <w:bottom w:type="dxa" w:w="80"/>
+              <w:right w:type="dxa" w:w="120"/>
+            </w:tcMar>
+          </w:tcPr>
+          <w:p>
+            <w:r>
+              <w:t xml:space="preserve">$75.00 each (one standard content page of up to approximately 800 words on an existing layout)</w:t>
+            </w:r>
+          </w:p>
+        </w:tc>
+      </w:tr>
+      <w:tr>
+        <w:tc>
+          <w:tcPr>
+            <w:tcW w:type="dxa" w:w="3000"/>
+            <w:tcBorders>
+              <w:top w:val="single" w:color="000000" w:sz="4"/>
+              <w:left w:val="single" w:color="000000" w:sz="4"/>
+              <w:bottom w:val="single" w:color="000000" w:sz="4"/>
+              <w:right w:val="single" w:color="000000" w:sz="4"/>
+            </w:tcBorders>
+            <w:shd w:fill="F1F3F8" w:color="auto" w:val="clear"/>
+            <w:tcMar>
+              <w:top w:type="dxa" w:w="80"/>
+              <w:left w:type="dxa" w:w="120"/>
+              <w:bottom w:type="dxa" w:w="80"/>
+              <w:right w:type="dxa" w:w="120"/>
+            </w:tcMar>
+          </w:tcPr>
+          <w:p>
+            <w:r>
+              <w:rPr>
+                <w:b/>
+                <w:bCs/>
+              </w:rPr>
+              <w:t xml:space="preserve">Additional blog post</w:t>
+            </w:r>
+          </w:p>
+        </w:tc>
+        <w:tc>
+          <w:tcPr>
+            <w:tcW w:type="dxa" w:w="6360"/>
+            <w:tcBorders>
+              <w:top w:val="single" w:color="000000" w:sz="4"/>
+              <w:left w:val="single" w:color="000000" w:sz="4"/>
+              <w:bottom w:val="single" w:color="000000" w:sz="4"/>
+              <w:right w:val="single" w:color="000000" w:sz="4"/>
+            </w:tcBorders>
+            <w:tcMar>
+              <w:top w:type="dxa" w:w="80"/>
+              <w:left w:type="dxa" w:w="120"/>
+              <w:bottom w:type="dxa" w:w="80"/>
+              <w:right w:type="dxa" w:w="120"/>
+            </w:tcMar>
+          </w:tcPr>
+          <w:p>
+            <w:r>
+              <w:t xml:space="preserve">$50.00 each (one SEO-optimized draft of up to approximately 1,000 words)</w:t>
+            </w:r>
+          </w:p>
+        </w:tc>
+      </w:tr>
+      <w:tr>
+        <w:tc>
+          <w:tcPr>
+            <w:tcW w:type="dxa" w:w="3000"/>
+            <w:tcBorders>
+              <w:top w:val="single" w:color="000000" w:sz="4"/>
+              <w:left w:val="single" w:color="000000" w:sz="4"/>
+              <w:bottom w:val="single" w:color="000000" w:sz="4"/>
+              <w:right w:val="single" w:color="000000" w:sz="4"/>
+            </w:tcBorders>
+            <w:shd w:fill="F1F3F8" w:color="auto" w:val="clear"/>
+            <w:tcMar>
+              <w:top w:type="dxa" w:w="80"/>
+              <w:left w:type="dxa" w:w="120"/>
+              <w:bottom w:type="dxa" w:w="80"/>
+              <w:right w:type="dxa" w:w="120"/>
+            </w:tcMar>
+          </w:tcPr>
+          <w:p>
+            <w:r>
+              <w:rPr>
+                <w:b/>
+                <w:bCs/>
+              </w:rPr>
+              <w:t xml:space="preserve">Custom work</w:t>
+            </w:r>
+          </w:p>
+        </w:tc>
+        <w:tc>
+          <w:tcPr>
+            <w:tcW w:type="dxa" w:w="6360"/>
+            <w:tcBorders>
+              <w:top w:val="single" w:color="000000" w:sz="4"/>
+              <w:left w:val="single" w:color="000000" w:sz="4"/>
+              <w:bottom w:val="single" w:color="000000" w:sz="4"/>
+              <w:right w:val="single" w:color="000000" w:sz="4"/>
+            </w:tcBorders>
+            <w:tcMar>
+              <w:top w:type="dxa" w:w="80"/>
+              <w:left w:type="dxa" w:w="120"/>
+              <w:bottom w:type="dxa" w:w="80"/>
+              <w:right w:type="dxa" w:w="120"/>
+            </w:tcMar>
+          </w:tcPr>
+          <w:p>
+            <w:r>
+              <w:t xml:space="preserve">Custom-designed layouts, landing pages with forms or booking integrations, and other work are quoted separately by written change order.</w:t>
+            </w:r>
+          </w:p>
+        </w:tc>
+      </w:tr>
+    </w:tbl>
+    <w:p>
+      <w:pPr>
+        <w:keepNext/>
+        <w:spacing w:after="80" w:before="160"/>
+      </w:pPr>
+      <w:r>
+        <w:rPr>
+          <w:b/>
+          <w:bCs/>
+          <w:color w:val="1F2A44"/>
+          <w:sz w:val="22"/>
+          <w:szCs w:val="22"/>
+        </w:rPr>
+        <w:t xml:space="preserve">H. SEO-Only Renewal Services</w:t>
       </w:r>
     </w:p>
     <w:p>

</xml_diff>